<commit_message>
feat(sementic serch ): use mongoDB atlas search for vector embedding for uploaded files
</commit_message>
<xml_diff>
--- a/docs/snapbridge-product-roadmap.docx
+++ b/docs/snapbridge-product-roadmap.docx
@@ -407,7 +407,7 @@
         <w:spacing w:after="120" w:before="240"/>
       </w:pPr>
       <w:r>
-        <w:t xml:space="preserve">Phase 2 — Vault &amp; Document Storage</w:t>
+        <w:t xml:space="preserve">Phase 2 — Vault + Semantic Search (CURRENT)</w:t>
       </w:r>
     </w:p>
     <w:p>
@@ -419,7 +419,7 @@
           <w:i/>
           <w:iCs/>
         </w:rPr>
-        <w:t xml:space="preserve">Goal: Store screenshots and documents. Make everything searchable. Timeline: Weeks 7–10.</w:t>
+        <w:t xml:space="preserve">Goal: Manual upload vault with vector embeddings and natural-language Q&amp;A. Timeline: Weeks 7–12.</w:t>
       </w:r>
     </w:p>
     <w:tbl>
@@ -508,6 +508,270 @@
                 <w:b w:val="false"/>
                 <w:bCs w:val="false"/>
               </w:rPr>
+              <w:t xml:space="preserve">Document Vault</w:t>
+            </w:r>
+          </w:p>
+        </w:tc>
+        <w:tc>
+          <w:tcPr>
+            <w:tcW w:type="pct" w:w="33.333333333333336%"/>
+          </w:tcPr>
+          <w:p>
+            <w:r>
+              <w:rPr>
+                <w:b w:val="false"/>
+                <w:bCs w:val="false"/>
+              </w:rPr>
+              <w:t xml:space="preserve">Upload PDF, DOCX, images via Cloudinary signed upload</w:t>
+            </w:r>
+          </w:p>
+        </w:tc>
+      </w:tr>
+      <w:tr>
+        <w:tc>
+          <w:tcPr>
+            <w:tcW w:type="pct" w:w="33.333333333333336%"/>
+          </w:tcPr>
+          <w:p>
+            <w:r>
+              <w:rPr>
+                <w:b w:val="false"/>
+                <w:bCs w:val="false"/>
+              </w:rPr>
+              <w:t xml:space="preserve">2</w:t>
+            </w:r>
+          </w:p>
+        </w:tc>
+        <w:tc>
+          <w:tcPr>
+            <w:tcW w:type="pct" w:w="33.333333333333336%"/>
+          </w:tcPr>
+          <w:p>
+            <w:r>
+              <w:rPr>
+                <w:b w:val="false"/>
+                <w:bCs w:val="false"/>
+              </w:rPr>
+              <w:t xml:space="preserve">Text Extraction</w:t>
+            </w:r>
+          </w:p>
+        </w:tc>
+        <w:tc>
+          <w:tcPr>
+            <w:tcW w:type="pct" w:w="33.333333333333336%"/>
+          </w:tcPr>
+          <w:p>
+            <w:r>
+              <w:rPr>
+                <w:b w:val="false"/>
+                <w:bCs w:val="false"/>
+              </w:rPr>
+              <w:t xml:space="preserve">PDF parse, DOCX parse, OCR for images (BullMQ worker)</w:t>
+            </w:r>
+          </w:p>
+        </w:tc>
+      </w:tr>
+      <w:tr>
+        <w:tc>
+          <w:tcPr>
+            <w:tcW w:type="pct" w:w="33.333333333333336%"/>
+          </w:tcPr>
+          <w:p>
+            <w:r>
+              <w:rPr>
+                <w:b w:val="false"/>
+                <w:bCs w:val="false"/>
+              </w:rPr>
+              <w:t xml:space="preserve">3</w:t>
+            </w:r>
+          </w:p>
+        </w:tc>
+        <w:tc>
+          <w:tcPr>
+            <w:tcW w:type="pct" w:w="33.333333333333336%"/>
+          </w:tcPr>
+          <w:p>
+            <w:r>
+              <w:rPr>
+                <w:b w:val="false"/>
+                <w:bCs w:val="false"/>
+              </w:rPr>
+              <w:t xml:space="preserve">Chunking + Embeddings</w:t>
+            </w:r>
+          </w:p>
+        </w:tc>
+        <w:tc>
+          <w:tcPr>
+            <w:tcW w:type="pct" w:w="33.333333333333336%"/>
+          </w:tcPr>
+          <w:p>
+            <w:r>
+              <w:rPr>
+                <w:b w:val="false"/>
+                <w:bCs w:val="false"/>
+              </w:rPr>
+              <w:t xml:space="preserve">OpenAI embeddings stored in MongoDB Atlas Vector Search</w:t>
+            </w:r>
+          </w:p>
+        </w:tc>
+      </w:tr>
+      <w:tr>
+        <w:tc>
+          <w:tcPr>
+            <w:tcW w:type="pct" w:w="33.333333333333336%"/>
+          </w:tcPr>
+          <w:p>
+            <w:r>
+              <w:rPr>
+                <w:b w:val="false"/>
+                <w:bCs w:val="false"/>
+              </w:rPr>
+              <w:t xml:space="preserve">4</w:t>
+            </w:r>
+          </w:p>
+        </w:tc>
+        <w:tc>
+          <w:tcPr>
+            <w:tcW w:type="pct" w:w="33.333333333333336%"/>
+          </w:tcPr>
+          <w:p>
+            <w:r>
+              <w:rPr>
+                <w:b w:val="false"/>
+                <w:bCs w:val="false"/>
+              </w:rPr>
+              <w:t xml:space="preserve">Semantic Ask</w:t>
+            </w:r>
+          </w:p>
+        </w:tc>
+        <w:tc>
+          <w:tcPr>
+            <w:tcW w:type="pct" w:w="33.333333333333336%"/>
+          </w:tcPr>
+          <w:p>
+            <w:r>
+              <w:rPr>
+                <w:b w:val="false"/>
+                <w:bCs w:val="false"/>
+              </w:rPr>
+              <w:t xml:space="preserve">Natural-language questions with vector search + optional AI answer</w:t>
+            </w:r>
+          </w:p>
+        </w:tc>
+      </w:tr>
+      <w:tr>
+        <w:tc>
+          <w:tcPr>
+            <w:tcW w:type="pct" w:w="33.333333333333336%"/>
+          </w:tcPr>
+          <w:p>
+            <w:r>
+              <w:rPr>
+                <w:b w:val="false"/>
+                <w:bCs w:val="false"/>
+              </w:rPr>
+              <w:t xml:space="preserve">5</w:t>
+            </w:r>
+          </w:p>
+        </w:tc>
+        <w:tc>
+          <w:tcPr>
+            <w:tcW w:type="pct" w:w="33.333333333333336%"/>
+          </w:tcPr>
+          <w:p>
+            <w:r>
+              <w:rPr>
+                <w:b w:val="false"/>
+                <w:bCs w:val="false"/>
+              </w:rPr>
+              <w:t xml:space="preserve">Smart Folders</w:t>
+            </w:r>
+          </w:p>
+        </w:tc>
+        <w:tc>
+          <w:tcPr>
+            <w:tcW w:type="pct" w:w="33.333333333333336%"/>
+          </w:tcPr>
+          <w:p>
+            <w:r>
+              <w:rPr>
+                <w:b w:val="false"/>
+                <w:bCs w:val="false"/>
+              </w:rPr>
+              <w:t xml:space="preserve">Auto-classify: Bills, Work, Study, Career, Legal, Personal</w:t>
+            </w:r>
+          </w:p>
+        </w:tc>
+      </w:tr>
+      <w:tr>
+        <w:tc>
+          <w:tcPr>
+            <w:tcW w:type="pct" w:w="33.333333333333336%"/>
+          </w:tcPr>
+          <w:p>
+            <w:r>
+              <w:rPr>
+                <w:b w:val="false"/>
+                <w:bCs w:val="false"/>
+              </w:rPr>
+              <w:t xml:space="preserve">6</w:t>
+            </w:r>
+          </w:p>
+        </w:tc>
+        <w:tc>
+          <w:tcPr>
+            <w:tcW w:type="pct" w:w="33.333333333333336%"/>
+          </w:tcPr>
+          <w:p>
+            <w:r>
+              <w:rPr>
+                <w:b w:val="false"/>
+                <w:bCs w:val="false"/>
+              </w:rPr>
+              <w:t xml:space="preserve">Manual Folders</w:t>
+            </w:r>
+          </w:p>
+        </w:tc>
+        <w:tc>
+          <w:tcPr>
+            <w:tcW w:type="pct" w:w="33.333333333333336%"/>
+          </w:tcPr>
+          <w:p>
+            <w:r>
+              <w:rPr>
+                <w:b w:val="false"/>
+                <w:bCs w:val="false"/>
+              </w:rPr>
+              <w:t xml:space="preserve">User folders, move documents</w:t>
+            </w:r>
+          </w:p>
+        </w:tc>
+      </w:tr>
+      <w:tr>
+        <w:tc>
+          <w:tcPr>
+            <w:tcW w:type="pct" w:w="33.333333333333336%"/>
+          </w:tcPr>
+          <w:p>
+            <w:r>
+              <w:rPr>
+                <w:b w:val="false"/>
+                <w:bCs w:val="false"/>
+              </w:rPr>
+              <w:t xml:space="preserve">7</w:t>
+            </w:r>
+          </w:p>
+        </w:tc>
+        <w:tc>
+          <w:tcPr>
+            <w:tcW w:type="pct" w:w="33.333333333333336%"/>
+          </w:tcPr>
+          <w:p>
+            <w:r>
+              <w:rPr>
+                <w:b w:val="false"/>
+                <w:bCs w:val="false"/>
+              </w:rPr>
               <w:t xml:space="preserve">Screenshot Vault</w:t>
             </w:r>
           </w:p>
@@ -522,293 +786,56 @@
                 <w:b w:val="false"/>
                 <w:bCs w:val="false"/>
               </w:rPr>
-              <w:t xml:space="preserve">Import screenshots. Organized library</w:t>
-            </w:r>
-          </w:p>
-        </w:tc>
-      </w:tr>
-      <w:tr>
-        <w:tc>
-          <w:tcPr>
-            <w:tcW w:type="pct" w:w="33.333333333333336%"/>
-          </w:tcPr>
-          <w:p>
-            <w:r>
-              <w:rPr>
-                <w:b w:val="false"/>
-                <w:bCs w:val="false"/>
-              </w:rPr>
-              <w:t xml:space="preserve">2</w:t>
-            </w:r>
-          </w:p>
-        </w:tc>
-        <w:tc>
-          <w:tcPr>
-            <w:tcW w:type="pct" w:w="33.333333333333336%"/>
-          </w:tcPr>
-          <w:p>
-            <w:r>
-              <w:rPr>
-                <w:b w:val="false"/>
-                <w:bCs w:val="false"/>
-              </w:rPr>
-              <w:t xml:space="preserve">Document Vault</w:t>
-            </w:r>
-          </w:p>
-        </w:tc>
-        <w:tc>
-          <w:tcPr>
-            <w:tcW w:type="pct" w:w="33.333333333333336%"/>
-          </w:tcPr>
-          <w:p>
-            <w:r>
-              <w:rPr>
-                <w:b w:val="false"/>
-                <w:bCs w:val="false"/>
-              </w:rPr>
-              <w:t xml:space="preserve">Upload PDF, DOCX, images, audio, video manually</w:t>
-            </w:r>
-          </w:p>
-        </w:tc>
-      </w:tr>
-      <w:tr>
-        <w:tc>
-          <w:tcPr>
-            <w:tcW w:type="pct" w:w="33.333333333333336%"/>
-          </w:tcPr>
-          <w:p>
-            <w:r>
-              <w:rPr>
-                <w:b w:val="false"/>
-                <w:bCs w:val="false"/>
-              </w:rPr>
-              <w:t xml:space="preserve">3</w:t>
-            </w:r>
-          </w:p>
-        </w:tc>
-        <w:tc>
-          <w:tcPr>
-            <w:tcW w:type="pct" w:w="33.333333333333336%"/>
-          </w:tcPr>
-          <w:p>
-            <w:r>
-              <w:rPr>
-                <w:b w:val="false"/>
-                <w:bCs w:val="false"/>
-              </w:rPr>
-              <w:t xml:space="preserve">OCR Search</w:t>
-            </w:r>
-          </w:p>
-        </w:tc>
-        <w:tc>
-          <w:tcPr>
-            <w:tcW w:type="pct" w:w="33.333333333333336%"/>
-          </w:tcPr>
-          <w:p>
-            <w:r>
-              <w:rPr>
-                <w:b w:val="false"/>
-                <w:bCs w:val="false"/>
-              </w:rPr>
-              <w:t xml:space="preserve">Extract text from screenshots and image PDFs</w:t>
-            </w:r>
-          </w:p>
-        </w:tc>
-      </w:tr>
-      <w:tr>
-        <w:tc>
-          <w:tcPr>
-            <w:tcW w:type="pct" w:w="33.333333333333336%"/>
-          </w:tcPr>
-          <w:p>
-            <w:r>
-              <w:rPr>
-                <w:b w:val="false"/>
-                <w:bCs w:val="false"/>
-              </w:rPr>
-              <w:t xml:space="preserve">4</w:t>
-            </w:r>
-          </w:p>
-        </w:tc>
-        <w:tc>
-          <w:tcPr>
-            <w:tcW w:type="pct" w:w="33.333333333333336%"/>
-          </w:tcPr>
-          <w:p>
-            <w:r>
-              <w:rPr>
-                <w:b w:val="false"/>
-                <w:bCs w:val="false"/>
-              </w:rPr>
-              <w:t xml:space="preserve">Smart Folders</w:t>
-            </w:r>
-          </w:p>
-        </w:tc>
-        <w:tc>
-          <w:tcPr>
-            <w:tcW w:type="pct" w:w="33.333333333333336%"/>
-          </w:tcPr>
-          <w:p>
-            <w:r>
-              <w:rPr>
-                <w:b w:val="false"/>
-                <w:bCs w:val="false"/>
-              </w:rPr>
-              <w:t xml:space="preserve">Auto-sort: Bills, Work, Study, Career, Legal, Personal</w:t>
-            </w:r>
-          </w:p>
-        </w:tc>
-      </w:tr>
-      <w:tr>
-        <w:tc>
-          <w:tcPr>
-            <w:tcW w:type="pct" w:w="33.333333333333336%"/>
-          </w:tcPr>
-          <w:p>
-            <w:r>
-              <w:rPr>
-                <w:b w:val="false"/>
-                <w:bCs w:val="false"/>
-              </w:rPr>
-              <w:t xml:space="preserve">5</w:t>
-            </w:r>
-          </w:p>
-        </w:tc>
-        <w:tc>
-          <w:tcPr>
-            <w:tcW w:type="pct" w:w="33.333333333333336%"/>
-          </w:tcPr>
-          <w:p>
-            <w:r>
-              <w:rPr>
-                <w:b w:val="false"/>
-                <w:bCs w:val="false"/>
-              </w:rPr>
-              <w:t xml:space="preserve">Manual Folders</w:t>
-            </w:r>
-          </w:p>
-        </w:tc>
-        <w:tc>
-          <w:tcPr>
-            <w:tcW w:type="pct" w:w="33.333333333333336%"/>
-          </w:tcPr>
-          <w:p>
-            <w:r>
-              <w:rPr>
-                <w:b w:val="false"/>
-                <w:bCs w:val="false"/>
-              </w:rPr>
-              <w:t xml:space="preserve">User-created folders and subfolders</w:t>
-            </w:r>
-          </w:p>
-        </w:tc>
-      </w:tr>
-      <w:tr>
-        <w:tc>
-          <w:tcPr>
-            <w:tcW w:type="pct" w:w="33.333333333333336%"/>
-          </w:tcPr>
-          <w:p>
-            <w:r>
-              <w:rPr>
-                <w:b w:val="false"/>
-                <w:bCs w:val="false"/>
-              </w:rPr>
-              <w:t xml:space="preserve">6</w:t>
-            </w:r>
-          </w:p>
-        </w:tc>
-        <w:tc>
-          <w:tcPr>
-            <w:tcW w:type="pct" w:w="33.333333333333336%"/>
-          </w:tcPr>
-          <w:p>
-            <w:r>
-              <w:rPr>
-                <w:b w:val="false"/>
-                <w:bCs w:val="false"/>
-              </w:rPr>
-              <w:t xml:space="preserve">Tags</w:t>
-            </w:r>
-          </w:p>
-        </w:tc>
-        <w:tc>
-          <w:tcPr>
-            <w:tcW w:type="pct" w:w="33.333333333333336%"/>
-          </w:tcPr>
-          <w:p>
-            <w:r>
-              <w:rPr>
-                <w:b w:val="false"/>
-                <w:bCs w:val="false"/>
-              </w:rPr>
-              <w:t xml:space="preserve">Manual tags on any item</w:t>
-            </w:r>
-          </w:p>
-        </w:tc>
-      </w:tr>
-      <w:tr>
-        <w:tc>
-          <w:tcPr>
-            <w:tcW w:type="pct" w:w="33.333333333333336%"/>
-          </w:tcPr>
-          <w:p>
-            <w:r>
-              <w:rPr>
-                <w:b w:val="false"/>
-                <w:bCs w:val="false"/>
-              </w:rPr>
-              <w:t xml:space="preserve">7</w:t>
-            </w:r>
-          </w:p>
-        </w:tc>
-        <w:tc>
-          <w:tcPr>
-            <w:tcW w:type="pct" w:w="33.333333333333336%"/>
-          </w:tcPr>
-          <w:p>
-            <w:r>
-              <w:rPr>
-                <w:b w:val="false"/>
-                <w:bCs w:val="false"/>
-              </w:rPr>
-              <w:t xml:space="preserve">Bulk Actions</w:t>
-            </w:r>
-          </w:p>
-        </w:tc>
-        <w:tc>
-          <w:tcPr>
-            <w:tcW w:type="pct" w:w="33.333333333333336%"/>
-          </w:tcPr>
-          <w:p>
-            <w:r>
-              <w:rPr>
-                <w:b w:val="false"/>
-                <w:bCs w:val="false"/>
-              </w:rPr>
-              <w:t xml:space="preserve">Move, delete, export ZIP for multiple items</w:t>
+              <w:t xml:space="preserve">Image uploads via same pipeline</w:t>
+            </w:r>
+          </w:p>
+        </w:tc>
+      </w:tr>
+      <w:tr>
+        <w:tc>
+          <w:tcPr>
+            <w:tcW w:type="pct" w:w="33.333333333333336%"/>
+          </w:tcPr>
+          <w:p>
+            <w:r>
+              <w:rPr>
+                <w:b w:val="false"/>
+                <w:bCs w:val="false"/>
+              </w:rPr>
+              <w:t xml:space="preserve">8</w:t>
+            </w:r>
+          </w:p>
+        </w:tc>
+        <w:tc>
+          <w:tcPr>
+            <w:tcW w:type="pct" w:w="33.333333333333336%"/>
+          </w:tcPr>
+          <w:p>
+            <w:r>
+              <w:rPr>
+                <w:b w:val="false"/>
+                <w:bCs w:val="false"/>
+              </w:rPr>
+              <w:t xml:space="preserve">Keyword Fallback</w:t>
+            </w:r>
+          </w:p>
+        </w:tc>
+        <w:tc>
+          <w:tcPr>
+            <w:tcW w:type="pct" w:w="33.333333333333336%"/>
+          </w:tcPr>
+          <w:p>
+            <w:r>
+              <w:rPr>
+                <w:b w:val="false"/>
+                <w:bCs w:val="false"/>
+              </w:rPr>
+              <w:t xml:space="preserve">MongoDB text index when vector score is low</w:t>
             </w:r>
           </w:p>
         </w:tc>
       </w:tr>
     </w:tbl>
-    <w:p>
-      <w:pPr>
-        <w:spacing w:after="120"/>
-      </w:pPr>
-      <w:r>
-        <w:t xml:space="preserve"/>
-      </w:r>
-    </w:p>
-    <w:p>
-      <w:pPr>
-        <w:pStyle w:val="Heading1"/>
-        <w:spacing w:after="120" w:before="240"/>
-      </w:pPr>
-      <w:r>
-        <w:t xml:space="preserve">Phase 3 — Universal Search &amp; Intelligence</w:t>
-      </w:r>
-    </w:p>
     <w:p>
       <w:pPr>
         <w:spacing w:after="120"/>
@@ -818,7 +845,36 @@
           <w:i/>
           <w:iCs/>
         </w:rPr>
-        <w:t xml:space="preserve">Goal: One search bar + AI Q&amp;A with citations. Timeline: Weeks 11–16.</w:t>
+        <w:t xml:space="preserve">Stack: MongoDB Atlas Vector Search (no Pinecone), BullMQ, OpenAI embeddings.</w:t>
+      </w:r>
+    </w:p>
+    <w:p>
+      <w:pPr>
+        <w:spacing w:after="120"/>
+      </w:pPr>
+      <w:r>
+        <w:t xml:space="preserve"/>
+      </w:r>
+    </w:p>
+    <w:p>
+      <w:pPr>
+        <w:pStyle w:val="Heading1"/>
+        <w:spacing w:after="120" w:before="240"/>
+      </w:pPr>
+      <w:r>
+        <w:t xml:space="preserve">Phase 3 — Projects &amp; Advanced Intelligence</w:t>
+      </w:r>
+    </w:p>
+    <w:p>
+      <w:pPr>
+        <w:spacing w:after="120"/>
+      </w:pPr>
+      <w:r>
+        <w:rPr>
+          <w:i/>
+          <w:iCs/>
+        </w:rPr>
+        <w:t xml:space="preserve">Goal: Project workspaces, scoped Q&amp;A, PDF chat UI. Timeline: Weeks 13–18.</w:t>
       </w:r>
     </w:p>
     <w:tbl>
@@ -907,21 +963,21 @@
                 <w:b w:val="false"/>
                 <w:bCs w:val="false"/>
               </w:rPr>
-              <w:t xml:space="preserve">Universal Search</w:t>
-            </w:r>
-          </w:p>
-        </w:tc>
-        <w:tc>
-          <w:tcPr>
-            <w:tcW w:type="pct" w:w="33.333333333333336%"/>
-          </w:tcPr>
-          <w:p>
-            <w:r>
-              <w:rPr>
-                <w:b w:val="false"/>
-                <w:bCs w:val="false"/>
-              </w:rPr>
-              <w:t xml:space="preserve">Search clips, screenshots, documents — keyword + semantic</w:t>
+              <w:t xml:space="preserve">Projects</w:t>
+            </w:r>
+          </w:p>
+        </w:tc>
+        <w:tc>
+          <w:tcPr>
+            <w:tcW w:type="pct" w:w="33.333333333333336%"/>
+          </w:tcPr>
+          <w:p>
+            <w:r>
+              <w:rPr>
+                <w:b w:val="false"/>
+                <w:bCs w:val="false"/>
+              </w:rPr>
+              <w:t xml:space="preserve">Workspaces per topic — MongoDB refs</w:t>
             </w:r>
           </w:p>
         </w:tc>
@@ -951,21 +1007,21 @@
                 <w:b w:val="false"/>
                 <w:bCs w:val="false"/>
               </w:rPr>
-              <w:t xml:space="preserve">Projects</w:t>
-            </w:r>
-          </w:p>
-        </w:tc>
-        <w:tc>
-          <w:tcPr>
-            <w:tcW w:type="pct" w:w="33.333333333333336%"/>
-          </w:tcPr>
-          <w:p>
-            <w:r>
-              <w:rPr>
-                <w:b w:val="false"/>
-                <w:bCs w:val="false"/>
-              </w:rPr>
-              <w:t xml:space="preserve">Workspaces per topic — link related docs</w:t>
+              <w:t xml:space="preserve">Folder Q&amp;A</w:t>
+            </w:r>
+          </w:p>
+        </w:tc>
+        <w:tc>
+          <w:tcPr>
+            <w:tcW w:type="pct" w:w="33.333333333333336%"/>
+          </w:tcPr>
+          <w:p>
+            <w:r>
+              <w:rPr>
+                <w:b w:val="false"/>
+                <w:bCs w:val="false"/>
+              </w:rPr>
+              <w:t xml:space="preserve">Ask scoped to folder or project</w:t>
             </w:r>
           </w:p>
         </w:tc>
@@ -995,21 +1051,21 @@
                 <w:b w:val="false"/>
                 <w:bCs w:val="false"/>
               </w:rPr>
-              <w:t xml:space="preserve">PDF Chat</w:t>
-            </w:r>
-          </w:p>
-        </w:tc>
-        <w:tc>
-          <w:tcPr>
-            <w:tcW w:type="pct" w:w="33.333333333333336%"/>
-          </w:tcPr>
-          <w:p>
-            <w:r>
-              <w:rPr>
-                <w:b w:val="false"/>
-                <w:bCs w:val="false"/>
-              </w:rPr>
-              <w:t xml:space="preserve">Ask questions about a PDF with page citations</w:t>
+              <w:t xml:space="preserve">PDF Chat UI</w:t>
+            </w:r>
+          </w:p>
+        </w:tc>
+        <w:tc>
+          <w:tcPr>
+            <w:tcW w:type="pct" w:w="33.333333333333336%"/>
+          </w:tcPr>
+          <w:p>
+            <w:r>
+              <w:rPr>
+                <w:b w:val="false"/>
+                <w:bCs w:val="false"/>
+              </w:rPr>
+              <w:t xml:space="preserve">Chat panel per document with citations</w:t>
             </w:r>
           </w:p>
         </w:tc>
@@ -1039,21 +1095,21 @@
                 <w:b w:val="false"/>
                 <w:bCs w:val="false"/>
               </w:rPr>
-              <w:t xml:space="preserve">Folder Q&amp;A</w:t>
-            </w:r>
-          </w:p>
-        </w:tc>
-        <w:tc>
-          <w:tcPr>
-            <w:tcW w:type="pct" w:w="33.333333333333336%"/>
-          </w:tcPr>
-          <w:p>
-            <w:r>
-              <w:rPr>
-                <w:b w:val="false"/>
-                <w:bCs w:val="false"/>
-              </w:rPr>
-              <w:t xml:space="preserve">Ask scoped to folder: Summarize this project</w:t>
+              <w:t xml:space="preserve">Entity Extraction</w:t>
+            </w:r>
+          </w:p>
+        </w:tc>
+        <w:tc>
+          <w:tcPr>
+            <w:tcW w:type="pct" w:w="33.333333333333336%"/>
+          </w:tcPr>
+          <w:p>
+            <w:r>
+              <w:rPr>
+                <w:b w:val="false"/>
+                <w:bCs w:val="false"/>
+              </w:rPr>
+              <w:t xml:space="preserve">Auto-detect people, dates, amounts</w:t>
             </w:r>
           </w:p>
         </w:tc>
@@ -1083,21 +1139,21 @@
                 <w:b w:val="false"/>
                 <w:bCs w:val="false"/>
               </w:rPr>
-              <w:t xml:space="preserve">Entity Extraction</w:t>
-            </w:r>
-          </w:p>
-        </w:tc>
-        <w:tc>
-          <w:tcPr>
-            <w:tcW w:type="pct" w:w="33.333333333333336%"/>
-          </w:tcPr>
-          <w:p>
-            <w:r>
-              <w:rPr>
-                <w:b w:val="false"/>
-                <w:bCs w:val="false"/>
-              </w:rPr>
-              <w:t xml:space="preserve">Auto-detect people, dates, amounts, companies</w:t>
+              <w:t xml:space="preserve">Duplicate Detection</w:t>
+            </w:r>
+          </w:p>
+        </w:tc>
+        <w:tc>
+          <w:tcPr>
+            <w:tcW w:type="pct" w:w="33.333333333333336%"/>
+          </w:tcPr>
+          <w:p>
+            <w:r>
+              <w:rPr>
+                <w:b w:val="false"/>
+                <w:bCs w:val="false"/>
+              </w:rPr>
+              <w:t xml:space="preserve">Flag similar documents</w:t>
             </w:r>
           </w:p>
         </w:tc>
@@ -1127,21 +1183,21 @@
                 <w:b w:val="false"/>
                 <w:bCs w:val="false"/>
               </w:rPr>
-              <w:t xml:space="preserve">Duplicate Detection</w:t>
-            </w:r>
-          </w:p>
-        </w:tc>
-        <w:tc>
-          <w:tcPr>
-            <w:tcW w:type="pct" w:w="33.333333333333336%"/>
-          </w:tcPr>
-          <w:p>
-            <w:r>
-              <w:rPr>
-                <w:b w:val="false"/>
-                <w:bCs w:val="false"/>
-              </w:rPr>
-              <w:t xml:space="preserve">Flag similar items, suggest cleanup</w:t>
+              <w:t xml:space="preserve">Timeline View</w:t>
+            </w:r>
+          </w:p>
+        </w:tc>
+        <w:tc>
+          <w:tcPr>
+            <w:tcW w:type="pct" w:w="33.333333333333336%"/>
+          </w:tcPr>
+          <w:p>
+            <w:r>
+              <w:rPr>
+                <w:b w:val="false"/>
+                <w:bCs w:val="false"/>
+              </w:rPr>
+              <w:t xml:space="preserve">Browse uploads chronologically</w:t>
             </w:r>
           </w:p>
         </w:tc>
@@ -1171,21 +1227,21 @@
                 <w:b w:val="false"/>
                 <w:bCs w:val="false"/>
               </w:rPr>
-              <w:t xml:space="preserve">Timeline View</w:t>
-            </w:r>
-          </w:p>
-        </w:tc>
-        <w:tc>
-          <w:tcPr>
-            <w:tcW w:type="pct" w:w="33.333333333333336%"/>
-          </w:tcPr>
-          <w:p>
-            <w:r>
-              <w:rPr>
-                <w:b w:val="false"/>
-                <w:bCs w:val="false"/>
-              </w:rPr>
-              <w:t xml:space="preserve">Browse captures chronologically</w:t>
+              <w:t xml:space="preserve">Saved Searches</w:t>
+            </w:r>
+          </w:p>
+        </w:tc>
+        <w:tc>
+          <w:tcPr>
+            <w:tcW w:type="pct" w:w="33.333333333333336%"/>
+          </w:tcPr>
+          <w:p>
+            <w:r>
+              <w:rPr>
+                <w:b w:val="false"/>
+                <w:bCs w:val="false"/>
+              </w:rPr>
+              <w:t xml:space="preserve">Save frequent queries</w:t>
             </w:r>
           </w:p>
         </w:tc>
@@ -1215,21 +1271,21 @@
                 <w:b w:val="false"/>
                 <w:bCs w:val="false"/>
               </w:rPr>
-              <w:t xml:space="preserve">Saved Searches</w:t>
-            </w:r>
-          </w:p>
-        </w:tc>
-        <w:tc>
-          <w:tcPr>
-            <w:tcW w:type="pct" w:w="33.333333333333336%"/>
-          </w:tcPr>
-          <w:p>
-            <w:r>
-              <w:rPr>
-                <w:b w:val="false"/>
-                <w:bCs w:val="false"/>
-              </w:rPr>
-              <w:t xml:space="preserve">Save frequent queries</w:t>
+              <w:t xml:space="preserve">Hybrid Search UI</w:t>
+            </w:r>
+          </w:p>
+        </w:tc>
+        <w:tc>
+          <w:tcPr>
+            <w:tcW w:type="pct" w:w="33.333333333333336%"/>
+          </w:tcPr>
+          <w:p>
+            <w:r>
+              <w:rPr>
+                <w:b w:val="false"/>
+                <w:bCs w:val="false"/>
+              </w:rPr>
+              <w:t xml:space="preserve">Universal search bar</w:t>
             </w:r>
           </w:p>
         </w:tc>

</xml_diff>